<commit_message>
Deployed e35dfcd with MkDocs version: 1.6.1
</commit_message>
<xml_diff>
--- a/PRESS_methodology_note.docx
+++ b/PRESS_methodology_note.docx
@@ -1,6 +1,6 @@
 
 <file path=word/document.xml><?xml version="1.0" encoding="utf-8"?>
-<w:document xmlns:wpc="http://schemas.microsoft.com/office/word/2010/wordprocessingCanvas" xmlns:cx="http://schemas.microsoft.com/office/drawing/2014/chartex" xmlns:cx1="http://schemas.microsoft.com/office/drawing/2015/9/8/chartex" xmlns:cx2="http://schemas.microsoft.com/office/drawing/2015/10/21/chartex" xmlns:cx3="http://schemas.microsoft.com/office/drawing/2016/5/9/chartex" xmlns:cx4="http://schemas.microsoft.com/office/drawing/2016/5/10/chartex" xmlns:cx5="http://schemas.microsoft.com/office/drawing/2016/5/11/chartex" xmlns:cx6="http://schemas.microsoft.com/office/drawing/2016/5/12/chartex" xmlns:cx7="http://schemas.microsoft.com/office/drawing/2016/5/13/chartex" xmlns:cx8="http://schemas.microsoft.com/office/drawing/2016/5/14/chartex" xmlns:mc="http://schemas.openxmlformats.org/markup-compatibility/2006" xmlns:aink="http://schemas.microsoft.com/office/drawing/2016/ink" xmlns:am3d="http://schemas.microsoft.com/office/drawing/2017/model3d" xmlns:o="urn:schemas-microsoft-com:office:office" xmlns:oel="http://schemas.microsoft.com/office/2019/extlst" xmlns:r="http://schemas.openxmlformats.org/officeDocument/2006/relationships" xmlns:m="http://schemas.openxmlformats.org/officeDocument/2006/math" xmlns:v="urn:schemas-microsoft-com:vml" xmlns:wp14="http://schemas.microsoft.com/office/word/2010/wordprocessingDrawing" xmlns:wp="http://schemas.openxmlformats.org/drawingml/2006/wordprocessingDrawing" xmlns:w10="urn:schemas-microsoft-com:office:word" xmlns:w="http://schemas.openxmlformats.org/wordprocessingml/2006/main" xmlns:w14="http://schemas.microsoft.com/office/word/2010/wordml" xmlns:w15="http://schemas.microsoft.com/office/word/2012/wordml" xmlns:w16cex="http://schemas.microsoft.com/office/word/2018/wordml/cex" xmlns:w16cid="http://schemas.microsoft.com/office/word/2016/wordml/cid" xmlns:w16="http://schemas.microsoft.com/office/word/2018/wordml" xmlns:w16du="http://schemas.microsoft.com/office/word/2023/wordml/word16du" xmlns:w16sdtdh="http://schemas.microsoft.com/office/word/2020/wordml/sdtdatahash" xmlns:w16sdtfl="http://schemas.microsoft.com/office/word/2024/wordml/sdtformatlock" xmlns:w16se="http://schemas.microsoft.com/office/word/2015/wordml/symex" xmlns:wpg="http://schemas.microsoft.com/office/word/2010/wordprocessingGroup" xmlns:wpi="http://schemas.microsoft.com/office/word/2010/wordprocessingInk" xmlns:wne="http://schemas.microsoft.com/office/word/2006/wordml" xmlns:wps="http://schemas.microsoft.com/office/word/2010/wordprocessingShape" mc:Ignorable="w14 w15 w16se w16cid w16 w16cex w16sdtdh w16sdtfl w16du wp14">
+<w:document xmlns:wpc="http://schemas.microsoft.com/office/word/2010/wordprocessingCanvas" xmlns:cx="http://schemas.microsoft.com/office/drawing/2014/chartex" xmlns:cx1="http://schemas.microsoft.com/office/drawing/2015/9/8/chartex" xmlns:cx2="http://schemas.microsoft.com/office/drawing/2015/10/21/chartex" xmlns:cx3="http://schemas.microsoft.com/office/drawing/2016/5/9/chartex" xmlns:cx4="http://schemas.microsoft.com/office/drawing/2016/5/10/chartex" xmlns:cx5="http://schemas.microsoft.com/office/drawing/2016/5/11/chartex" xmlns:cx6="http://schemas.microsoft.com/office/drawing/2016/5/12/chartex" xmlns:cx7="http://schemas.microsoft.com/office/drawing/2016/5/13/chartex" xmlns:cx8="http://schemas.microsoft.com/office/drawing/2016/5/14/chartex" xmlns:mc="http://schemas.openxmlformats.org/markup-compatibility/2006" xmlns:aink="http://schemas.microsoft.com/office/drawing/2016/ink" xmlns:am3d="http://schemas.microsoft.com/office/drawing/2017/model3d" xmlns:o="urn:schemas-microsoft-com:office:office" xmlns:oel="http://schemas.microsoft.com/office/2019/extlst" xmlns:r="http://schemas.openxmlformats.org/officeDocument/2006/relationships" xmlns:m="http://schemas.openxmlformats.org/officeDocument/2006/math" xmlns:v="urn:schemas-microsoft-com:vml" xmlns:wp14="http://schemas.microsoft.com/office/word/2010/wordprocessingDrawing" xmlns:wp="http://schemas.openxmlformats.org/drawingml/2006/wordprocessingDrawing" xmlns:w10="urn:schemas-microsoft-com:office:word" xmlns:w="http://schemas.openxmlformats.org/wordprocessingml/2006/main" xmlns:w14="http://schemas.microsoft.com/office/word/2010/wordml" xmlns:w15="http://schemas.microsoft.com/office/word/2012/wordml" xmlns:w16cex="http://schemas.microsoft.com/office/word/2018/wordml/cex" xmlns:w16cid="http://schemas.microsoft.com/office/word/2016/wordml/cid" xmlns:w16="http://schemas.microsoft.com/office/word/2018/wordml" xmlns:w16du="http://schemas.microsoft.com/office/word/2023/wordml/word16du" xmlns:w16sdtdh="http://schemas.microsoft.com/office/word/2020/wordml/sdtdatahash" xmlns:w16sdtfl="http://schemas.microsoft.com/office/word/2024/wordml/sdtformatlock" xmlns:w16se="http://schemas.microsoft.com/office/word/2015/wordml/symex" xmlns:wpg="http://schemas.microsoft.com/office/word/2010/wordprocessingGroup" xmlns:wpi="http://schemas.microsoft.com/office/word/2010/wordprocessingInk" xmlns:wne="http://schemas.microsoft.com/office/word/2006/wordml" xmlns:wps="http://schemas.microsoft.com/office/word/2010/wordprocessingShape" xmlns:a="http://schemas.openxmlformats.org/drawingml/2006/main" xmlns:pic="http://schemas.openxmlformats.org/drawingml/2006/picture" xmlns:a14="http://schemas.microsoft.com/office/drawing/2010/main" mc:Ignorable="w14 w15 w16se w16cid w16 w16cex w16sdtdh w16sdtfl w16du wp14">
   <w:body>
     <w:p>
       <w:pPr>
@@ -12,7 +12,7 @@
           <w:lang w:val="en-GB"/>
         </w:rPr>
       </w:pPr>
-      <w:bookmarkStart w:id="0" w:name="_Toc210804203"/>
+      <w:bookmarkStart w:name="_Toc210804203" w:id="0"/>
       <w:r>
         <w:rPr>
           <w:b/>
@@ -89,26 +89,31 @@
     </w:p>
     <w:sdt>
       <w:sdtPr>
-        <w:rPr>
-          <w:rFonts w:asciiTheme="minorHAnsi" w:eastAsiaTheme="minorHAnsi" w:hAnsiTheme="minorHAnsi" w:cstheme="minorBidi"/>
-          <w:color w:val="auto"/>
-          <w:kern w:val="2"/>
-          <w:sz w:val="24"/>
-          <w:szCs w:val="24"/>
-          <w:lang w:val="en-GB"/>
-          <w14:ligatures w14:val="standardContextual"/>
-        </w:rPr>
         <w:id w:val="1864015207"/>
         <w:docPartObj>
           <w:docPartGallery w:val="Table of Contents"/>
           <w:docPartUnique/>
         </w:docPartObj>
+        <w:rPr>
+          <w:rFonts w:ascii="Calibri" w:hAnsi="Calibri" w:eastAsia="Calibri" w:cs="Arial" w:asciiTheme="minorAscii" w:hAnsiTheme="minorAscii" w:eastAsiaTheme="minorAscii" w:cstheme="minorBidi"/>
+          <w:color w:val="auto"/>
+          <w:kern w:val="2"/>
+          <w:sz w:val="24"/>
+          <w:szCs w:val="24"/>
+          <w:lang w:val="en-GB"/>
+          <w14:ligatures w14:val="standardContextual"/>
+        </w:rPr>
       </w:sdtPr>
       <w:sdtEndPr>
         <w:rPr>
-          <w:b/>
-          <w:bCs/>
+          <w:rFonts w:ascii="Calibri" w:hAnsi="Calibri" w:eastAsia="Calibri" w:cs="Arial" w:asciiTheme="minorAscii" w:hAnsiTheme="minorAscii" w:eastAsiaTheme="minorAscii" w:cstheme="minorBidi"/>
+          <w:b w:val="1"/>
+          <w:bCs w:val="1"/>
           <w:noProof/>
+          <w:color w:val="auto"/>
+          <w:sz w:val="24"/>
+          <w:szCs w:val="24"/>
+          <w:lang w:val="en-GB"/>
         </w:rPr>
       </w:sdtEndPr>
       <w:sdtContent>
@@ -155,7 +160,7 @@
               <w:noProof/>
             </w:rPr>
           </w:pPr>
-          <w:hyperlink w:anchor="_Toc211410913" w:history="1">
+          <w:hyperlink w:history="1" w:anchor="_Toc211410913">
             <w:r>
               <w:rPr>
                 <w:rStyle w:val="Hyperlink"/>
@@ -225,7 +230,7 @@
               <w:noProof/>
             </w:rPr>
           </w:pPr>
-          <w:hyperlink w:anchor="_Toc211410914" w:history="1">
+          <w:hyperlink w:history="1" w:anchor="_Toc211410914">
             <w:r>
               <w:rPr>
                 <w:rStyle w:val="Hyperlink"/>
@@ -296,7 +301,7 @@
               <w:noProof/>
             </w:rPr>
           </w:pPr>
-          <w:hyperlink w:anchor="_Toc211410915" w:history="1">
+          <w:hyperlink w:history="1" w:anchor="_Toc211410915">
             <w:r>
               <w:rPr>
                 <w:rStyle w:val="Hyperlink"/>
@@ -382,7 +387,7 @@
               <w:noProof/>
             </w:rPr>
           </w:pPr>
-          <w:hyperlink w:anchor="_Toc211410916" w:history="1">
+          <w:hyperlink w:history="1" w:anchor="_Toc211410916">
             <w:r>
               <w:rPr>
                 <w:rStyle w:val="Hyperlink"/>
@@ -468,7 +473,7 @@
               <w:noProof/>
             </w:rPr>
           </w:pPr>
-          <w:hyperlink w:anchor="_Toc211410917" w:history="1">
+          <w:hyperlink w:history="1" w:anchor="_Toc211410917">
             <w:r>
               <w:rPr>
                 <w:rStyle w:val="Hyperlink"/>
@@ -554,7 +559,7 @@
               <w:noProof/>
             </w:rPr>
           </w:pPr>
-          <w:hyperlink w:anchor="_Toc211410918" w:history="1">
+          <w:hyperlink w:history="1" w:anchor="_Toc211410918">
             <w:r>
               <w:rPr>
                 <w:rStyle w:val="Hyperlink"/>
@@ -640,7 +645,7 @@
               <w:noProof/>
             </w:rPr>
           </w:pPr>
-          <w:hyperlink w:anchor="_Toc211410919" w:history="1">
+          <w:hyperlink w:history="1" w:anchor="_Toc211410919">
             <w:r>
               <w:rPr>
                 <w:rStyle w:val="Hyperlink"/>
@@ -725,7 +730,7 @@
               <w:noProof/>
             </w:rPr>
           </w:pPr>
-          <w:hyperlink w:anchor="_Toc211410920" w:history="1">
+          <w:hyperlink w:history="1" w:anchor="_Toc211410920">
             <w:r>
               <w:rPr>
                 <w:rStyle w:val="Hyperlink"/>
@@ -812,7 +817,7 @@
               <w:noProof/>
             </w:rPr>
           </w:pPr>
-          <w:hyperlink w:anchor="_Toc211410921" w:history="1">
+          <w:hyperlink w:history="1" w:anchor="_Toc211410921">
             <w:r>
               <w:rPr>
                 <w:rStyle w:val="Hyperlink"/>
@@ -898,7 +903,7 @@
               <w:noProof/>
             </w:rPr>
           </w:pPr>
-          <w:hyperlink w:anchor="_Toc211410922" w:history="1">
+          <w:hyperlink w:history="1" w:anchor="_Toc211410922">
             <w:r>
               <w:rPr>
                 <w:rStyle w:val="Hyperlink"/>
@@ -983,7 +988,7 @@
               <w:noProof/>
             </w:rPr>
           </w:pPr>
-          <w:hyperlink w:anchor="_Toc211410923" w:history="1">
+          <w:hyperlink w:history="1" w:anchor="_Toc211410923">
             <w:r>
               <w:rPr>
                 <w:rStyle w:val="Hyperlink"/>
@@ -1053,7 +1058,7 @@
               <w:noProof/>
             </w:rPr>
           </w:pPr>
-          <w:hyperlink w:anchor="_Toc211410924" w:history="1">
+          <w:hyperlink w:history="1" w:anchor="_Toc211410924">
             <w:r>
               <w:rPr>
                 <w:rStyle w:val="Hyperlink"/>
@@ -1123,7 +1128,7 @@
               <w:noProof/>
             </w:rPr>
           </w:pPr>
-          <w:hyperlink w:anchor="_Toc211410925" w:history="1">
+          <w:hyperlink w:history="1" w:anchor="_Toc211410925">
             <w:r>
               <w:rPr>
                 <w:rStyle w:val="Hyperlink"/>
@@ -1193,7 +1198,7 @@
               <w:noProof/>
             </w:rPr>
           </w:pPr>
-          <w:hyperlink w:anchor="_Toc211410926" w:history="1">
+          <w:hyperlink w:history="1" w:anchor="_Toc211410926">
             <w:r>
               <w:rPr>
                 <w:rStyle w:val="Hyperlink"/>
@@ -1263,7 +1268,7 @@
               <w:noProof/>
             </w:rPr>
           </w:pPr>
-          <w:hyperlink w:anchor="_Toc211410927" w:history="1">
+          <w:hyperlink w:history="1" w:anchor="_Toc211410927">
             <w:r>
               <w:rPr>
                 <w:rStyle w:val="Hyperlink"/>
@@ -1333,7 +1338,7 @@
               <w:noProof/>
             </w:rPr>
           </w:pPr>
-          <w:hyperlink w:anchor="_Toc211410928" w:history="1">
+          <w:hyperlink w:history="1" w:anchor="_Toc211410928">
             <w:r>
               <w:rPr>
                 <w:rStyle w:val="Hyperlink"/>
@@ -1403,7 +1408,7 @@
               <w:noProof/>
             </w:rPr>
           </w:pPr>
-          <w:hyperlink w:anchor="_Toc211410929" w:history="1">
+          <w:hyperlink w:history="1" w:anchor="_Toc211410929">
             <w:r>
               <w:rPr>
                 <w:rStyle w:val="Hyperlink"/>
@@ -1473,7 +1478,7 @@
               <w:noProof/>
             </w:rPr>
           </w:pPr>
-          <w:hyperlink w:anchor="_Toc211410930" w:history="1">
+          <w:hyperlink w:history="1" w:anchor="_Toc211410930">
             <w:r>
               <w:rPr>
                 <w:rStyle w:val="Hyperlink"/>
@@ -1543,7 +1548,7 @@
               <w:noProof/>
             </w:rPr>
           </w:pPr>
-          <w:hyperlink w:anchor="_Toc211410931" w:history="1">
+          <w:hyperlink w:history="1" w:anchor="_Toc211410931">
             <w:r>
               <w:rPr>
                 <w:rStyle w:val="Hyperlink"/>
@@ -1670,7 +1675,7 @@
           <w:lang w:val="en-GB"/>
         </w:rPr>
       </w:pPr>
-      <w:bookmarkStart w:id="1" w:name="_Toc211410913"/>
+      <w:bookmarkStart w:name="_Toc211410913" w:id="1"/>
       <w:r>
         <w:rPr>
           <w:lang w:val="en-GB"/>
@@ -1761,7 +1766,7 @@
           <w:lang w:val="en-GB"/>
         </w:rPr>
       </w:pPr>
-      <w:bookmarkStart w:id="2" w:name="_Toc211410914"/>
+      <w:bookmarkStart w:name="_Toc211410914" w:id="2"/>
       <w:r>
         <w:rPr>
           <w:lang w:val="en-GB"/>
@@ -2396,12 +2401,11 @@
           <w:lang w:val="en-GB"/>
         </w:rPr>
       </w:pPr>
-      <w:bookmarkStart w:id="3" w:name="_Toc211410915"/>
-      <w:r>
-        <w:rPr>
-          <w:lang w:val="en-GB"/>
-        </w:rPr>
-        <w:lastRenderedPageBreak/>
+      <w:bookmarkStart w:name="_Toc211410915" w:id="3"/>
+      <w:r>
+        <w:rPr>
+          <w:lang w:val="en-GB"/>
+        </w:rPr>
         <w:t>Introduction</w:t>
       </w:r>
       <w:bookmarkEnd w:id="3"/>
@@ -2590,11 +2594,11 @@
           <w:lang w:val="en-GB"/>
         </w:rPr>
       </w:pPr>
-      <w:bookmarkStart w:id="4" w:name="_Ref211338036"/>
-      <w:bookmarkStart w:id="5" w:name="_Ref211338043"/>
-      <w:bookmarkStart w:id="6" w:name="_Ref211338063"/>
-      <w:bookmarkStart w:id="7" w:name="_Ref211338066"/>
-      <w:bookmarkStart w:id="8" w:name="_Toc211410916"/>
+      <w:bookmarkStart w:name="_Ref211338036" w:id="4"/>
+      <w:bookmarkStart w:name="_Ref211338043" w:id="5"/>
+      <w:bookmarkStart w:name="_Ref211338063" w:id="6"/>
+      <w:bookmarkStart w:name="_Ref211338066" w:id="7"/>
+      <w:bookmarkStart w:name="_Toc211410916" w:id="8"/>
       <w:r>
         <w:rPr>
           <w:lang w:val="en-GB"/>
@@ -2962,7 +2966,6 @@
         <w:rPr>
           <w:lang w:val="en-GB"/>
         </w:rPr>
-        <w:lastRenderedPageBreak/>
         <w:t>contributions to multilateral organisations, the donors are marked as the multilateral organisations (types 2 and 4 in</w:t>
       </w:r>
       <w:r>
@@ -3097,7 +3100,7 @@
           <w:lang w:val="en-GB"/>
         </w:rPr>
       </w:pPr>
-      <w:bookmarkStart w:id="9" w:name="_Ref211338263"/>
+      <w:bookmarkStart w:name="_Ref211338263" w:id="9"/>
       <w:r>
         <w:rPr>
           <w:lang w:val="en-GB"/>
@@ -3415,7 +3418,6 @@
         <w:rPr>
           <w:lang w:val="en-GB"/>
         </w:rPr>
-        <w:lastRenderedPageBreak/>
         <w:t>recipient, or payments to service providers in the case of activities conducted within donor countries (e.g. training or administrative costs). They may be reported on a gross basis (total funds released) or net basis (after deducting loan repayments or recovered grants).</w:t>
       </w:r>
     </w:p>
@@ -4017,16 +4019,15 @@
           <w:lang w:val="en-GB"/>
         </w:rPr>
       </w:pPr>
-      <w:bookmarkStart w:id="10" w:name="_Ref211338495"/>
-      <w:bookmarkStart w:id="11" w:name="_Ref211338507"/>
-      <w:bookmarkStart w:id="12" w:name="_Ref211338513"/>
-      <w:bookmarkStart w:id="13" w:name="_Ref211338517"/>
-      <w:bookmarkStart w:id="14" w:name="_Toc211410917"/>
-      <w:r>
-        <w:rPr>
-          <w:lang w:val="en-GB"/>
-        </w:rPr>
-        <w:lastRenderedPageBreak/>
+      <w:bookmarkStart w:name="_Ref211338495" w:id="10"/>
+      <w:bookmarkStart w:name="_Ref211338507" w:id="11"/>
+      <w:bookmarkStart w:name="_Ref211338513" w:id="12"/>
+      <w:bookmarkStart w:name="_Ref211338517" w:id="13"/>
+      <w:bookmarkStart w:name="_Toc211410917" w:id="14"/>
+      <w:r>
+        <w:rPr>
+          <w:lang w:val="en-GB"/>
+        </w:rPr>
         <w:t xml:space="preserve">Identifying </w:t>
       </w:r>
       <w:r>
@@ -4285,8 +4286,8 @@
           <w:lang w:val="en-GB"/>
         </w:rPr>
       </w:pPr>
-      <w:bookmarkStart w:id="15" w:name="_Ref211338543"/>
-      <w:bookmarkStart w:id="16" w:name="_Toc211410918"/>
+      <w:bookmarkStart w:name="_Ref211338543" w:id="15"/>
+      <w:bookmarkStart w:name="_Toc211410918" w:id="16"/>
       <w:r>
         <w:rPr>
           <w:lang w:val="en-GB"/>
@@ -4435,7 +4436,6 @@
         <w:rPr>
           <w:lang w:val="en-GB"/>
         </w:rPr>
-        <w:lastRenderedPageBreak/>
         <w:t>accented characters. This ensures that words like “survey,” “census,” or “statistical system” are consistently recognised regardless of formatting or language-specific variations</w:t>
       </w:r>
       <w:r>
@@ -4794,7 +4794,7 @@
           <w:lang w:val="en-GB"/>
         </w:rPr>
       </w:pPr>
-      <w:bookmarkStart w:id="17" w:name="_Toc211410919"/>
+      <w:bookmarkStart w:name="_Toc211410919" w:id="17"/>
       <w:r>
         <w:rPr>
           <w:lang w:val="en-GB"/>
@@ -4901,7 +4901,6 @@
           <w:bCs/>
           <w:lang w:val="en-GB"/>
         </w:rPr>
-        <w:lastRenderedPageBreak/>
         <w:t xml:space="preserve">Building the </w:t>
       </w:r>
       <w:r>
@@ -4976,7 +4975,7 @@
       <w:r>
         <w:t xml:space="preserve"> process text through built-in tokenization and are designed to handle natural language directly, capturing morphological and contextual information without requiring explicit lemmatization </w:t>
       </w:r>
-      <w:hyperlink r:id="rId9" w:history="1">
+      <w:hyperlink w:history="1" r:id="rId9">
         <w:r>
           <w:rPr>
             <w:rStyle w:val="Hyperlink"/>
@@ -5444,7 +5443,6 @@
         <w:rPr>
           <w:lang w:val="en-GB"/>
         </w:rPr>
-        <w:lastRenderedPageBreak/>
         <w:t>The resulting model was subsequently used to classify all remaining unlabelled CRS projects.</w:t>
       </w:r>
       <w:r>
@@ -5808,7 +5806,7 @@
           <w:lang w:val="en-GB"/>
         </w:rPr>
       </w:pPr>
-      <w:bookmarkStart w:id="18" w:name="_Ref211338223"/>
+      <w:bookmarkStart w:name="_Ref211338223" w:id="18"/>
       <w:r>
         <w:rPr>
           <w:sz w:val="22"/>
@@ -5890,6 +5888,7 @@
           <w:tcPr>
             <w:cnfStyle w:val="001000000000" w:firstRow="0" w:lastRow="0" w:firstColumn="1" w:lastColumn="0" w:oddVBand="0" w:evenVBand="0" w:oddHBand="0" w:evenHBand="0" w:firstRowFirstColumn="0" w:firstRowLastColumn="0" w:lastRowFirstColumn="0" w:lastRowLastColumn="0"/>
             <w:tcW w:w="1791" w:type="dxa"/>
+            <w:tcMar/>
           </w:tcPr>
           <w:p>
             <w:pPr>
@@ -5911,7 +5910,9 @@
         </w:tc>
         <w:tc>
           <w:tcPr>
+            <w:cnfStyle w:val="000000000000" w:firstRow="0" w:lastRow="0" w:firstColumn="0" w:lastColumn="0" w:oddVBand="0" w:evenVBand="0" w:oddHBand="0" w:evenHBand="0" w:firstRowFirstColumn="0" w:firstRowLastColumn="0" w:lastRowFirstColumn="0" w:lastRowLastColumn="0"/>
             <w:tcW w:w="1608" w:type="dxa"/>
+            <w:tcMar/>
           </w:tcPr>
           <w:p>
             <w:pPr>
@@ -5934,7 +5935,9 @@
         </w:tc>
         <w:tc>
           <w:tcPr>
+            <w:cnfStyle w:val="000000000000" w:firstRow="0" w:lastRow="0" w:firstColumn="0" w:lastColumn="0" w:oddVBand="0" w:evenVBand="0" w:oddHBand="0" w:evenHBand="0" w:firstRowFirstColumn="0" w:firstRowLastColumn="0" w:lastRowFirstColumn="0" w:lastRowLastColumn="0"/>
             <w:tcW w:w="2358" w:type="dxa"/>
+            <w:tcMar/>
           </w:tcPr>
           <w:p>
             <w:pPr>
@@ -5957,7 +5960,9 @@
         </w:tc>
         <w:tc>
           <w:tcPr>
+            <w:cnfStyle w:val="000000000000" w:firstRow="0" w:lastRow="0" w:firstColumn="0" w:lastColumn="0" w:oddVBand="0" w:evenVBand="0" w:oddHBand="0" w:evenHBand="0" w:firstRowFirstColumn="0" w:firstRowLastColumn="0" w:lastRowFirstColumn="0" w:lastRowLastColumn="0"/>
             <w:tcW w:w="2384" w:type="dxa"/>
+            <w:tcMar/>
           </w:tcPr>
           <w:p>
             <w:pPr>
@@ -5980,7 +5985,9 @@
         </w:tc>
         <w:tc>
           <w:tcPr>
+            <w:cnfStyle w:val="000000000000" w:firstRow="0" w:lastRow="0" w:firstColumn="0" w:lastColumn="0" w:oddVBand="0" w:evenVBand="0" w:oddHBand="0" w:evenHBand="0" w:firstRowFirstColumn="0" w:firstRowLastColumn="0" w:lastRowFirstColumn="0" w:lastRowLastColumn="0"/>
             <w:tcW w:w="885" w:type="dxa"/>
+            <w:tcMar/>
           </w:tcPr>
           <w:p>
             <w:pPr>
@@ -6010,6 +6017,7 @@
           <w:tcPr>
             <w:cnfStyle w:val="001000000000" w:firstRow="0" w:lastRow="0" w:firstColumn="1" w:lastColumn="0" w:oddVBand="0" w:evenVBand="0" w:oddHBand="0" w:evenHBand="0" w:firstRowFirstColumn="0" w:firstRowLastColumn="0" w:lastRowFirstColumn="0" w:lastRowLastColumn="0"/>
             <w:tcW w:w="1791" w:type="dxa"/>
+            <w:tcMar/>
           </w:tcPr>
           <w:p>
             <w:pPr>
@@ -6194,7 +6202,6 @@
                 <w:szCs w:val="22"/>
                 <w:lang w:val="en-GB"/>
               </w:rPr>
-              <w:lastRenderedPageBreak/>
               <w:t>en</w:t>
             </w:r>
             <w:proofErr w:type="spellEnd"/>
@@ -6278,7 +6285,9 @@
         </w:tc>
         <w:tc>
           <w:tcPr>
+            <w:cnfStyle w:val="000000000000" w:firstRow="0" w:lastRow="0" w:firstColumn="0" w:lastColumn="0" w:oddVBand="0" w:evenVBand="0" w:oddHBand="0" w:evenHBand="0" w:firstRowFirstColumn="0" w:firstRowLastColumn="0" w:lastRowFirstColumn="0" w:lastRowLastColumn="0"/>
             <w:tcW w:w="1608" w:type="dxa"/>
+            <w:tcMar/>
           </w:tcPr>
           <w:p>
             <w:pPr>
@@ -6295,14 +6304,15 @@
                 <w:szCs w:val="22"/>
                 <w:lang w:val="en-GB"/>
               </w:rPr>
-              <w:lastRenderedPageBreak/>
               <w:t>Employment creation</w:t>
             </w:r>
           </w:p>
         </w:tc>
         <w:tc>
           <w:tcPr>
+            <w:cnfStyle w:val="000000000000" w:firstRow="0" w:lastRow="0" w:firstColumn="0" w:lastColumn="0" w:oddVBand="0" w:evenVBand="0" w:oddHBand="0" w:evenHBand="0" w:firstRowFirstColumn="0" w:firstRowLastColumn="0" w:lastRowFirstColumn="0" w:lastRowLastColumn="0"/>
             <w:tcW w:w="2358" w:type="dxa"/>
+            <w:tcMar/>
           </w:tcPr>
           <w:p>
             <w:pPr>
@@ -6472,7 +6482,6 @@
                 <w:szCs w:val="22"/>
                 <w:lang w:val="en-GB"/>
               </w:rPr>
-              <w:lastRenderedPageBreak/>
               <w:t>servicio</w:t>
             </w:r>
             <w:proofErr w:type="spellEnd"/>
@@ -6552,7 +6561,9 @@
         </w:tc>
         <w:tc>
           <w:tcPr>
+            <w:cnfStyle w:val="000000000000" w:firstRow="0" w:lastRow="0" w:firstColumn="0" w:lastColumn="0" w:oddVBand="0" w:evenVBand="0" w:oddHBand="0" w:evenHBand="0" w:firstRowFirstColumn="0" w:firstRowLastColumn="0" w:lastRowFirstColumn="0" w:lastRowLastColumn="0"/>
             <w:tcW w:w="2384" w:type="dxa"/>
+            <w:tcMar/>
           </w:tcPr>
           <w:p>
             <w:pPr>
@@ -6569,7 +6580,6 @@
                 <w:szCs w:val="22"/>
                 <w:lang w:val="en-GB"/>
               </w:rPr>
-              <w:lastRenderedPageBreak/>
               <w:t xml:space="preserve">EMPLOYMENT POLICY AND ADMIN. MGMT.: Systems design and engineering, equipment procurement, software and hardware installation, testing and commissioning of a </w:t>
             </w:r>
             <w:r>
@@ -6578,14 +6588,15 @@
                 <w:szCs w:val="22"/>
                 <w:lang w:val="en-GB"/>
               </w:rPr>
-              <w:lastRenderedPageBreak/>
               <w:t>FUNDEI Statistical Information System (SIEF) and an Education-Industry electronic intermediation system (PNP-online).</w:t>
             </w:r>
           </w:p>
         </w:tc>
         <w:tc>
           <w:tcPr>
+            <w:cnfStyle w:val="000000000000" w:firstRow="0" w:lastRow="0" w:firstColumn="0" w:lastColumn="0" w:oddVBand="0" w:evenVBand="0" w:oddHBand="0" w:evenHBand="0" w:firstRowFirstColumn="0" w:firstRowLastColumn="0" w:lastRowFirstColumn="0" w:lastRowLastColumn="0"/>
             <w:tcW w:w="885" w:type="dxa"/>
+            <w:tcMar/>
           </w:tcPr>
           <w:p>
             <w:pPr>
@@ -6602,7 +6613,6 @@
                 <w:szCs w:val="22"/>
                 <w:lang w:val="en-GB"/>
               </w:rPr>
-              <w:lastRenderedPageBreak/>
               <w:t>0,9996</w:t>
             </w:r>
           </w:p>
@@ -6613,6 +6623,7 @@
           <w:tcPr>
             <w:cnfStyle w:val="001000000000" w:firstRow="0" w:lastRow="0" w:firstColumn="1" w:lastColumn="0" w:oddVBand="0" w:evenVBand="0" w:oddHBand="0" w:evenHBand="0" w:firstRowFirstColumn="0" w:firstRowLastColumn="0" w:lastRowFirstColumn="0" w:lastRowLastColumn="0"/>
             <w:tcW w:w="1791" w:type="dxa"/>
+            <w:tcMar/>
           </w:tcPr>
           <w:p>
             <w:pPr>
@@ -6694,7 +6705,9 @@
         </w:tc>
         <w:tc>
           <w:tcPr>
+            <w:cnfStyle w:val="000000000000" w:firstRow="0" w:lastRow="0" w:firstColumn="0" w:lastColumn="0" w:oddVBand="0" w:evenVBand="0" w:oddHBand="0" w:evenHBand="0" w:firstRowFirstColumn="0" w:firstRowLastColumn="0" w:lastRowFirstColumn="0" w:lastRowLastColumn="0"/>
             <w:tcW w:w="1608" w:type="dxa"/>
+            <w:tcMar/>
           </w:tcPr>
           <w:p>
             <w:pPr>
@@ -6717,7 +6730,9 @@
         </w:tc>
         <w:tc>
           <w:tcPr>
+            <w:cnfStyle w:val="000000000000" w:firstRow="0" w:lastRow="0" w:firstColumn="0" w:lastColumn="0" w:oddVBand="0" w:evenVBand="0" w:oddHBand="0" w:evenHBand="0" w:firstRowFirstColumn="0" w:firstRowLastColumn="0" w:lastRowFirstColumn="0" w:lastRowLastColumn="0"/>
             <w:tcW w:w="2358" w:type="dxa"/>
+            <w:tcMar/>
           </w:tcPr>
           <w:p>
             <w:pPr>
@@ -6848,7 +6863,9 @@
         </w:tc>
         <w:tc>
           <w:tcPr>
+            <w:cnfStyle w:val="000000000000" w:firstRow="0" w:lastRow="0" w:firstColumn="0" w:lastColumn="0" w:oddVBand="0" w:evenVBand="0" w:oddHBand="0" w:evenHBand="0" w:firstRowFirstColumn="0" w:firstRowLastColumn="0" w:lastRowFirstColumn="0" w:lastRowLastColumn="0"/>
             <w:tcW w:w="2384" w:type="dxa"/>
+            <w:tcMar/>
           </w:tcPr>
           <w:p>
             <w:pPr>
@@ -6871,7 +6888,9 @@
         </w:tc>
         <w:tc>
           <w:tcPr>
+            <w:cnfStyle w:val="000000000000" w:firstRow="0" w:lastRow="0" w:firstColumn="0" w:lastColumn="0" w:oddVBand="0" w:evenVBand="0" w:oddHBand="0" w:evenHBand="0" w:firstRowFirstColumn="0" w:firstRowLastColumn="0" w:lastRowFirstColumn="0" w:lastRowLastColumn="0"/>
             <w:tcW w:w="885" w:type="dxa"/>
+            <w:tcMar/>
           </w:tcPr>
           <w:p>
             <w:pPr>
@@ -6901,6 +6920,7 @@
           <w:tcPr>
             <w:cnfStyle w:val="001000000000" w:firstRow="0" w:lastRow="0" w:firstColumn="1" w:lastColumn="0" w:oddVBand="0" w:evenVBand="0" w:oddHBand="0" w:evenHBand="0" w:firstRowFirstColumn="0" w:firstRowLastColumn="0" w:lastRowFirstColumn="0" w:lastRowLastColumn="0"/>
             <w:tcW w:w="1791" w:type="dxa"/>
+            <w:tcMar/>
           </w:tcPr>
           <w:p>
             <w:pPr>
@@ -6926,7 +6946,9 @@
         </w:tc>
         <w:tc>
           <w:tcPr>
+            <w:cnfStyle w:val="000000000000" w:firstRow="0" w:lastRow="0" w:firstColumn="0" w:lastColumn="0" w:oddVBand="0" w:evenVBand="0" w:oddHBand="0" w:evenHBand="0" w:firstRowFirstColumn="0" w:firstRowLastColumn="0" w:lastRowFirstColumn="0" w:lastRowLastColumn="0"/>
             <w:tcW w:w="1608" w:type="dxa"/>
+            <w:tcMar/>
           </w:tcPr>
           <w:p>
             <w:pPr>
@@ -6949,7 +6971,9 @@
         </w:tc>
         <w:tc>
           <w:tcPr>
+            <w:cnfStyle w:val="000000000000" w:firstRow="0" w:lastRow="0" w:firstColumn="0" w:lastColumn="0" w:oddVBand="0" w:evenVBand="0" w:oddHBand="0" w:evenHBand="0" w:firstRowFirstColumn="0" w:firstRowLastColumn="0" w:lastRowFirstColumn="0" w:lastRowLastColumn="0"/>
             <w:tcW w:w="2358" w:type="dxa"/>
+            <w:tcMar/>
           </w:tcPr>
           <w:p>
             <w:pPr>
@@ -6990,7 +7014,9 @@
         </w:tc>
         <w:tc>
           <w:tcPr>
+            <w:cnfStyle w:val="000000000000" w:firstRow="0" w:lastRow="0" w:firstColumn="0" w:lastColumn="0" w:oddVBand="0" w:evenVBand="0" w:oddHBand="0" w:evenHBand="0" w:firstRowFirstColumn="0" w:firstRowLastColumn="0" w:lastRowFirstColumn="0" w:lastRowLastColumn="0"/>
             <w:tcW w:w="2384" w:type="dxa"/>
+            <w:tcMar/>
           </w:tcPr>
           <w:p>
             <w:pPr>
@@ -7005,7 +7031,9 @@
         </w:tc>
         <w:tc>
           <w:tcPr>
+            <w:cnfStyle w:val="000000000000" w:firstRow="0" w:lastRow="0" w:firstColumn="0" w:lastColumn="0" w:oddVBand="0" w:evenVBand="0" w:oddHBand="0" w:evenHBand="0" w:firstRowFirstColumn="0" w:firstRowLastColumn="0" w:lastRowFirstColumn="0" w:lastRowLastColumn="0"/>
             <w:tcW w:w="885" w:type="dxa"/>
+            <w:tcMar/>
           </w:tcPr>
           <w:p>
             <w:pPr>
@@ -7028,10 +7056,14 @@
         </w:tc>
       </w:tr>
       <w:tr>
+        <w:trPr>
+          <w:trHeight w:val="7095"/>
+        </w:trPr>
         <w:tc>
           <w:tcPr>
             <w:cnfStyle w:val="001000000000" w:firstRow="0" w:lastRow="0" w:firstColumn="1" w:lastColumn="0" w:oddVBand="0" w:evenVBand="0" w:oddHBand="0" w:evenHBand="0" w:firstRowFirstColumn="0" w:firstRowLastColumn="0" w:lastRowFirstColumn="0" w:lastRowLastColumn="0"/>
             <w:tcW w:w="1791" w:type="dxa"/>
+            <w:tcMar/>
           </w:tcPr>
           <w:p>
             <w:pPr>
@@ -7057,7 +7089,9 @@
         </w:tc>
         <w:tc>
           <w:tcPr>
+            <w:cnfStyle w:val="000000000000" w:firstRow="0" w:lastRow="0" w:firstColumn="0" w:lastColumn="0" w:oddVBand="0" w:evenVBand="0" w:oddHBand="0" w:evenHBand="0" w:firstRowFirstColumn="0" w:firstRowLastColumn="0" w:lastRowFirstColumn="0" w:lastRowLastColumn="0"/>
             <w:tcW w:w="1608" w:type="dxa"/>
+            <w:tcMar/>
           </w:tcPr>
           <w:p>
             <w:pPr>
@@ -7080,7 +7114,9 @@
         </w:tc>
         <w:tc>
           <w:tcPr>
+            <w:cnfStyle w:val="000000000000" w:firstRow="0" w:lastRow="0" w:firstColumn="0" w:lastColumn="0" w:oddVBand="0" w:evenVBand="0" w:oddHBand="0" w:evenHBand="0" w:firstRowFirstColumn="0" w:firstRowLastColumn="0" w:lastRowFirstColumn="0" w:lastRowLastColumn="0"/>
             <w:tcW w:w="2358" w:type="dxa"/>
+            <w:tcMar/>
           </w:tcPr>
           <w:p>
             <w:pPr>
@@ -7123,14 +7159,15 @@
                 <w:szCs w:val="22"/>
                 <w:lang w:val="fr-FR"/>
               </w:rPr>
-              <w:lastRenderedPageBreak/>
               <w:t>Système Permanent de Statistiques Agricoles, afin de contribuer à l'analyse de la situation et de</w:t>
             </w:r>
           </w:p>
         </w:tc>
         <w:tc>
           <w:tcPr>
+            <w:cnfStyle w:val="000000000000" w:firstRow="0" w:lastRow="0" w:firstColumn="0" w:lastColumn="0" w:oddVBand="0" w:evenVBand="0" w:oddHBand="0" w:evenHBand="0" w:firstRowFirstColumn="0" w:firstRowLastColumn="0" w:lastRowFirstColumn="0" w:lastRowLastColumn="0"/>
             <w:tcW w:w="2384" w:type="dxa"/>
+            <w:tcMar/>
           </w:tcPr>
           <w:p>
             <w:pPr>
@@ -7147,7 +7184,6 @@
                 <w:szCs w:val="22"/>
                 <w:lang w:val="en-GB"/>
               </w:rPr>
-              <w:lastRenderedPageBreak/>
               <w:t xml:space="preserve">DP1 FSTP PROGRAM 2013: Result 1: The central and decentralized structures of the MARNDR and the MSPP are able to coordinate and monitor food security interventions and provide quality support, in collaboration/synergy with other stakeholders in the sector. Result 2: Quality information on the agricultural sector is regularly produced by the MARNDR through a Permanent System of Agricultural Statistics, in order to contribute to </w:t>
             </w:r>
             <w:r>
@@ -7156,14 +7192,15 @@
                 <w:szCs w:val="22"/>
                 <w:lang w:val="en-GB"/>
               </w:rPr>
-              <w:lastRenderedPageBreak/>
               <w:t>the analysis of the situation and</w:t>
             </w:r>
           </w:p>
         </w:tc>
         <w:tc>
           <w:tcPr>
+            <w:cnfStyle w:val="000000000000" w:firstRow="0" w:lastRow="0" w:firstColumn="0" w:lastColumn="0" w:oddVBand="0" w:evenVBand="0" w:oddHBand="0" w:evenHBand="0" w:firstRowFirstColumn="0" w:firstRowLastColumn="0" w:lastRowFirstColumn="0" w:lastRowLastColumn="0"/>
             <w:tcW w:w="885" w:type="dxa"/>
+            <w:tcMar/>
           </w:tcPr>
           <w:p>
             <w:pPr>
@@ -7180,7 +7217,6 @@
                 <w:szCs w:val="22"/>
                 <w:lang w:val="en-GB"/>
               </w:rPr>
-              <w:lastRenderedPageBreak/>
               <w:t>0,9996</w:t>
             </w:r>
           </w:p>
@@ -7194,6 +7230,7 @@
           <w:tcPr>
             <w:cnfStyle w:val="001000000000" w:firstRow="0" w:lastRow="0" w:firstColumn="1" w:lastColumn="0" w:oddVBand="0" w:evenVBand="0" w:oddHBand="0" w:evenHBand="0" w:firstRowFirstColumn="0" w:firstRowLastColumn="0" w:lastRowFirstColumn="0" w:lastRowLastColumn="0"/>
             <w:tcW w:w="1791" w:type="dxa"/>
+            <w:tcMar/>
           </w:tcPr>
           <w:p>
             <w:pPr>
@@ -7219,7 +7256,9 @@
         </w:tc>
         <w:tc>
           <w:tcPr>
+            <w:cnfStyle w:val="000000000000" w:firstRow="0" w:lastRow="0" w:firstColumn="0" w:lastColumn="0" w:oddVBand="0" w:evenVBand="0" w:oddHBand="0" w:evenHBand="0" w:firstRowFirstColumn="0" w:firstRowLastColumn="0" w:lastRowFirstColumn="0" w:lastRowLastColumn="0"/>
             <w:tcW w:w="1608" w:type="dxa"/>
+            <w:tcMar/>
           </w:tcPr>
           <w:p>
             <w:pPr>
@@ -7242,7 +7281,9 @@
         </w:tc>
         <w:tc>
           <w:tcPr>
+            <w:cnfStyle w:val="000000000000" w:firstRow="0" w:lastRow="0" w:firstColumn="0" w:lastColumn="0" w:oddVBand="0" w:evenVBand="0" w:oddHBand="0" w:evenHBand="0" w:firstRowFirstColumn="0" w:firstRowLastColumn="0" w:lastRowFirstColumn="0" w:lastRowLastColumn="0"/>
             <w:tcW w:w="2358" w:type="dxa"/>
+            <w:tcMar/>
           </w:tcPr>
           <w:p>
             <w:pPr>
@@ -7302,7 +7343,9 @@
         </w:tc>
         <w:tc>
           <w:tcPr>
+            <w:cnfStyle w:val="000000000000" w:firstRow="0" w:lastRow="0" w:firstColumn="0" w:lastColumn="0" w:oddVBand="0" w:evenVBand="0" w:oddHBand="0" w:evenHBand="0" w:firstRowFirstColumn="0" w:firstRowLastColumn="0" w:lastRowFirstColumn="0" w:lastRowLastColumn="0"/>
             <w:tcW w:w="2384" w:type="dxa"/>
+            <w:tcMar/>
           </w:tcPr>
           <w:p>
             <w:pPr>
@@ -7317,7 +7360,9 @@
         </w:tc>
         <w:tc>
           <w:tcPr>
+            <w:cnfStyle w:val="000000000000" w:firstRow="0" w:lastRow="0" w:firstColumn="0" w:lastColumn="0" w:oddVBand="0" w:evenVBand="0" w:oddHBand="0" w:evenHBand="0" w:firstRowFirstColumn="0" w:firstRowLastColumn="0" w:lastRowFirstColumn="0" w:lastRowLastColumn="0"/>
             <w:tcW w:w="885" w:type="dxa"/>
+            <w:tcMar/>
           </w:tcPr>
           <w:p>
             <w:pPr>
@@ -7571,7 +7616,6 @@
         <w:rPr>
           <w:lang w:val="en-GB"/>
         </w:rPr>
-        <w:lastRenderedPageBreak/>
         <w:t>gender-related themes</w:t>
       </w:r>
       <w:r>
@@ -7614,7 +7658,7 @@
           <w:lang w:val="en-GB"/>
         </w:rPr>
       </w:pPr>
-      <w:bookmarkStart w:id="19" w:name="_Toc211410920"/>
+      <w:bookmarkStart w:name="_Toc211410920" w:id="19"/>
       <w:r>
         <w:rPr>
           <w:lang w:val="en-GB"/>
@@ -7811,12 +7855,11 @@
           <w:lang w:val="en-GB"/>
         </w:rPr>
       </w:pPr>
-      <w:bookmarkStart w:id="20" w:name="_Toc211410921"/>
-      <w:r>
-        <w:rPr>
-          <w:lang w:val="en-GB"/>
-        </w:rPr>
-        <w:lastRenderedPageBreak/>
+      <w:bookmarkStart w:name="_Toc211410921" w:id="20"/>
+      <w:r>
+        <w:rPr>
+          <w:lang w:val="en-GB"/>
+        </w:rPr>
         <w:t>Topic focus</w:t>
       </w:r>
       <w:bookmarkEnd w:id="20"/>
@@ -8120,12 +8163,11 @@
           <w:lang w:val="en-GB"/>
         </w:rPr>
       </w:pPr>
-      <w:bookmarkStart w:id="21" w:name="_Toc211410922"/>
-      <w:r>
-        <w:rPr>
-          <w:lang w:val="en-GB"/>
-        </w:rPr>
-        <w:lastRenderedPageBreak/>
+      <w:bookmarkStart w:name="_Toc211410922" w:id="21"/>
+      <w:r>
+        <w:rPr>
+          <w:lang w:val="en-GB"/>
+        </w:rPr>
         <w:t>Conclusion</w:t>
       </w:r>
       <w:bookmarkEnd w:id="21"/>
@@ -8476,12 +8518,11 @@
           <w:lang w:val="en-GB"/>
         </w:rPr>
       </w:pPr>
-      <w:bookmarkStart w:id="22" w:name="_Toc211410923"/>
-      <w:r>
-        <w:rPr>
-          <w:lang w:val="en-GB"/>
-        </w:rPr>
-        <w:lastRenderedPageBreak/>
+      <w:bookmarkStart w:name="_Toc211410923" w:id="22"/>
+      <w:r>
+        <w:rPr>
+          <w:lang w:val="en-GB"/>
+        </w:rPr>
         <w:t>References</w:t>
       </w:r>
       <w:bookmarkEnd w:id="22"/>
@@ -8740,7 +8781,7 @@
           <w:lang w:val="en-GB"/>
         </w:rPr>
       </w:pPr>
-      <w:bookmarkStart w:id="23" w:name="_Toc211410924"/>
+      <w:bookmarkStart w:name="_Toc211410924" w:id="23"/>
       <w:r>
         <w:rPr>
           <w:lang w:val="en-GB"/>
@@ -8762,7 +8803,7 @@
           <w:lang w:val="en-GB"/>
         </w:rPr>
       </w:pPr>
-      <w:bookmarkStart w:id="24" w:name="_Toc211410925"/>
+      <w:bookmarkStart w:name="_Toc211410925" w:id="24"/>
       <w:r>
         <w:rPr>
           <w:lang w:val="en-GB"/>
@@ -8822,7 +8863,7 @@
           <w:lang w:val="en-GB"/>
         </w:rPr>
       </w:pPr>
-      <w:bookmarkStart w:id="25" w:name="_Toc211410926"/>
+      <w:bookmarkStart w:name="_Toc211410926" w:id="25"/>
       <w:r>
         <w:rPr>
           <w:lang w:val="en-GB"/>
@@ -8931,7 +8972,7 @@
           <w:lang w:val="en-GB"/>
         </w:rPr>
       </w:pPr>
-      <w:bookmarkStart w:id="26" w:name="_Toc211410927"/>
+      <w:bookmarkStart w:name="_Toc211410927" w:id="26"/>
       <w:r>
         <w:rPr>
           <w:lang w:val="en-GB"/>
@@ -8956,7 +8997,6 @@
         <w:rPr>
           <w:lang w:val="en-GB"/>
         </w:rPr>
-        <w:lastRenderedPageBreak/>
         <w:t xml:space="preserve">International Monetary Fund, and the World Bank as a response to the need for accurate and reliable data to achieve and track progress toward development goals. </w:t>
       </w:r>
     </w:p>
@@ -9000,7 +9040,7 @@
           <w:lang w:val="en-GB"/>
         </w:rPr>
       </w:pPr>
-      <w:bookmarkStart w:id="27" w:name="_Toc211410928"/>
+      <w:bookmarkStart w:name="_Toc211410928" w:id="27"/>
       <w:r>
         <w:rPr>
           <w:lang w:val="en-GB"/>
@@ -9016,9 +9056,9 @@
           <w:lang w:val="en-GB"/>
         </w:rPr>
       </w:pPr>
-      <w:bookmarkStart w:id="28" w:name="_Ref211361102"/>
-      <w:bookmarkStart w:id="29" w:name="_Ref211340469"/>
-      <w:bookmarkStart w:id="30" w:name="_Toc211410929"/>
+      <w:bookmarkStart w:name="_Ref211361102" w:id="28"/>
+      <w:bookmarkStart w:name="_Ref211340469" w:id="29"/>
+      <w:bookmarkStart w:name="_Toc211410929" w:id="30"/>
       <w:r>
         <w:rPr>
           <w:lang w:val="en-GB"/>
@@ -9058,7 +9098,7 @@
           <w:lang w:val="en-GB"/>
         </w:rPr>
       </w:pPr>
-      <w:bookmarkStart w:id="31" w:name="_Toc211410882"/>
+      <w:bookmarkStart w:name="_Toc211410882" w:id="31"/>
       <w:r>
         <w:rPr>
           <w:noProof/>
@@ -9106,7 +9146,7 @@
           </wp:inline>
         </w:drawing>
       </w:r>
-      <w:bookmarkStart w:id="32" w:name="_Ref211340006"/>
+      <w:bookmarkStart w:name="_Ref211340006" w:id="32"/>
       <w:bookmarkEnd w:id="31"/>
     </w:p>
     <w:p>
@@ -9119,14 +9159,24 @@
       <w:r>
         <w:t xml:space="preserve">Figure </w:t>
       </w:r>
-      <w:fldSimple w:instr=" SEQ Figure \* ARABIC ">
-        <w:r>
-          <w:rPr>
-            <w:noProof/>
-          </w:rPr>
-          <w:t>2</w:t>
-        </w:r>
-      </w:fldSimple>
+      <w:r>
+        <w:fldChar w:fldCharType="begin"/>
+      </w:r>
+      <w:r>
+        <w:instrText> SEQ Figure \* ARABIC </w:instrText>
+      </w:r>
+      <w:r>
+        <w:fldChar w:fldCharType="separate"/>
+      </w:r>
+      <w:r>
+        <w:rPr>
+          <w:noProof/>
+        </w:rPr>
+        <w:t>2</w:t>
+      </w:r>
+      <w:r>
+        <w:fldChar w:fldCharType="end"/>
+      </w:r>
       <w:r>
         <w:t xml:space="preserve">: ROC curve after the final training </w:t>
       </w:r>
@@ -9152,8 +9202,8 @@
           <w:lang w:val="en-GB"/>
         </w:rPr>
       </w:pPr>
-      <w:bookmarkStart w:id="33" w:name="_Toc211410883"/>
-      <w:bookmarkStart w:id="34" w:name="_Toc211410930"/>
+      <w:bookmarkStart w:name="_Toc211410883" w:id="33"/>
+      <w:bookmarkStart w:name="_Toc211410930" w:id="34"/>
       <w:r>
         <w:rPr>
           <w:lang w:val="en-GB"/>
@@ -9196,9 +9246,9 @@
           <w:lang w:val="en-GB"/>
         </w:rPr>
       </w:pPr>
-      <w:bookmarkStart w:id="35" w:name="_Ref211340383"/>
-      <w:bookmarkStart w:id="36" w:name="_Toc211410884"/>
-      <w:bookmarkStart w:id="37" w:name="_Toc211410931"/>
+      <w:bookmarkStart w:name="_Ref211340383" w:id="35"/>
+      <w:bookmarkStart w:name="_Toc211410884" w:id="36"/>
+      <w:bookmarkStart w:name="_Toc211410931" w:id="37"/>
       <w:r>
         <w:rPr>
           <w:lang w:val="en-GB"/>
@@ -9242,7 +9292,7 @@
       </w:pPr>
     </w:p>
     <w:sectPr>
-      <w:pgSz w:w="11906" w:h="16838"/>
+      <w:pgSz w:w="11906" w:h="16838" w:orient="portrait"/>
       <w:pgMar w:top="1440" w:right="1440" w:bottom="709" w:left="1440" w:header="708" w:footer="708" w:gutter="0"/>
       <w:cols w:space="708"/>
       <w:docGrid w:linePitch="360"/>
@@ -9321,7 +9371,7 @@
       <w:r>
         <w:t xml:space="preserve"> in the </w:t>
       </w:r>
-      <w:hyperlink r:id="rId1" w:history="1">
+      <w:hyperlink w:history="1" r:id="rId1">
         <w:r>
           <w:rPr>
             <w:rStyle w:val="Hyperlink"/>
@@ -9403,7 +9453,7 @@
       <w:r>
         <w:t xml:space="preserve">ode 16062 is not a voluntary code. See the </w:t>
       </w:r>
-      <w:hyperlink r:id="rId2" w:history="1">
+      <w:hyperlink w:history="1" r:id="rId2">
         <w:r>
           <w:rPr>
             <w:rStyle w:val="Hyperlink"/>
@@ -9439,7 +9489,7 @@
       <w:r>
         <w:t xml:space="preserve"> The definitions follow the </w:t>
       </w:r>
-      <w:hyperlink r:id="rId3" w:history="1">
+      <w:hyperlink w:history="1" r:id="rId3">
         <w:r>
           <w:rPr>
             <w:rStyle w:val="Hyperlink"/>
@@ -9469,7 +9519,7 @@
       <w:r>
         <w:t xml:space="preserve"> For more information on policy markers, please consult the </w:t>
       </w:r>
-      <w:hyperlink r:id="rId4" w:history="1">
+      <w:hyperlink w:history="1" r:id="rId4">
         <w:r>
           <w:rPr>
             <w:rStyle w:val="Hyperlink"/>
@@ -9580,7 +9630,7 @@
         </w:rPr>
         <w:t xml:space="preserve"> </w:t>
       </w:r>
-      <w:hyperlink r:id="rId5" w:history="1">
+      <w:hyperlink w:history="1" r:id="rId5">
         <w:proofErr w:type="spellStart"/>
         <w:r>
           <w:rPr>
@@ -9604,7 +9654,7 @@
         </w:rPr>
         <w:t xml:space="preserve"> </w:t>
       </w:r>
-      <w:hyperlink r:id="rId6" w:history="1">
+      <w:hyperlink w:history="1" r:id="rId6">
         <w:r>
           <w:rPr>
             <w:rStyle w:val="Hyperlink"/>
@@ -9691,7 +9741,7 @@
       <w:r>
         <w:t xml:space="preserve"> Lemmatization was implemented through the NLP package </w:t>
       </w:r>
-      <w:hyperlink r:id="rId7" w:history="1">
+      <w:hyperlink w:history="1" r:id="rId7">
         <w:proofErr w:type="spellStart"/>
         <w:r>
           <w:rPr>
@@ -9734,7 +9784,7 @@
       <w:r>
         <w:t xml:space="preserve"> </w:t>
       </w:r>
-      <w:hyperlink r:id="rId8" w:history="1">
+      <w:hyperlink w:history="1" r:id="rId8">
         <w:r>
           <w:rPr>
             <w:rStyle w:val="Hyperlink"/>
@@ -9841,7 +9891,7 @@
       <w:r>
         <w:t xml:space="preserve"> </w:t>
       </w:r>
-      <w:hyperlink r:id="rId9" w:history="1">
+      <w:hyperlink w:history="1" r:id="rId9">
         <w:r>
           <w:rPr>
             <w:rStyle w:val="Hyperlink"/>
@@ -9855,7 +9905,7 @@
       <w:r>
         <w:t xml:space="preserve"> </w:t>
       </w:r>
-      <w:hyperlink r:id="rId10" w:history="1">
+      <w:hyperlink w:history="1" r:id="rId10">
         <w:r>
           <w:rPr>
             <w:rStyle w:val="Hyperlink"/>
@@ -10200,7 +10250,7 @@
         </w:rPr>
         <w:t xml:space="preserve"> complete list of financial instruments in the CRS, please consult the </w:t>
       </w:r>
-      <w:hyperlink r:id="rId11" w:history="1">
+      <w:hyperlink w:history="1" r:id="rId11">
         <w:r>
           <w:rPr>
             <w:rStyle w:val="Hyperlink"/>
@@ -10465,7 +10515,7 @@
         <w:ind w:left="720" w:hanging="360"/>
       </w:pPr>
       <w:rPr>
-        <w:rFonts w:ascii="Calibri" w:eastAsiaTheme="minorHAnsi" w:hAnsi="Calibri" w:cs="Calibri" w:hint="default"/>
+        <w:rFonts w:hint="default" w:ascii="Calibri" w:hAnsi="Calibri" w:cs="Calibri" w:eastAsiaTheme="minorHAnsi"/>
       </w:rPr>
     </w:lvl>
     <w:lvl w:ilvl="1" w:tplc="04090003" w:tentative="1">
@@ -10477,7 +10527,7 @@
         <w:ind w:left="1440" w:hanging="360"/>
       </w:pPr>
       <w:rPr>
-        <w:rFonts w:ascii="Courier New" w:hAnsi="Courier New" w:cs="Courier New" w:hint="default"/>
+        <w:rFonts w:hint="default" w:ascii="Courier New" w:hAnsi="Courier New" w:cs="Courier New"/>
       </w:rPr>
     </w:lvl>
     <w:lvl w:ilvl="2" w:tplc="04090005" w:tentative="1">
@@ -10489,7 +10539,7 @@
         <w:ind w:left="2160" w:hanging="360"/>
       </w:pPr>
       <w:rPr>
-        <w:rFonts w:ascii="Wingdings" w:hAnsi="Wingdings" w:hint="default"/>
+        <w:rFonts w:hint="default" w:ascii="Wingdings" w:hAnsi="Wingdings"/>
       </w:rPr>
     </w:lvl>
     <w:lvl w:ilvl="3" w:tplc="04090001" w:tentative="1">
@@ -10501,7 +10551,7 @@
         <w:ind w:left="2880" w:hanging="360"/>
       </w:pPr>
       <w:rPr>
-        <w:rFonts w:ascii="Symbol" w:hAnsi="Symbol" w:hint="default"/>
+        <w:rFonts w:hint="default" w:ascii="Symbol" w:hAnsi="Symbol"/>
       </w:rPr>
     </w:lvl>
     <w:lvl w:ilvl="4" w:tplc="04090003" w:tentative="1">
@@ -10513,7 +10563,7 @@
         <w:ind w:left="3600" w:hanging="360"/>
       </w:pPr>
       <w:rPr>
-        <w:rFonts w:ascii="Courier New" w:hAnsi="Courier New" w:cs="Courier New" w:hint="default"/>
+        <w:rFonts w:hint="default" w:ascii="Courier New" w:hAnsi="Courier New" w:cs="Courier New"/>
       </w:rPr>
     </w:lvl>
     <w:lvl w:ilvl="5" w:tplc="04090005" w:tentative="1">
@@ -10525,7 +10575,7 @@
         <w:ind w:left="4320" w:hanging="360"/>
       </w:pPr>
       <w:rPr>
-        <w:rFonts w:ascii="Wingdings" w:hAnsi="Wingdings" w:hint="default"/>
+        <w:rFonts w:hint="default" w:ascii="Wingdings" w:hAnsi="Wingdings"/>
       </w:rPr>
     </w:lvl>
     <w:lvl w:ilvl="6" w:tplc="04090001" w:tentative="1">
@@ -10537,7 +10587,7 @@
         <w:ind w:left="5040" w:hanging="360"/>
       </w:pPr>
       <w:rPr>
-        <w:rFonts w:ascii="Symbol" w:hAnsi="Symbol" w:hint="default"/>
+        <w:rFonts w:hint="default" w:ascii="Symbol" w:hAnsi="Symbol"/>
       </w:rPr>
     </w:lvl>
     <w:lvl w:ilvl="7" w:tplc="04090003" w:tentative="1">
@@ -10549,7 +10599,7 @@
         <w:ind w:left="5760" w:hanging="360"/>
       </w:pPr>
       <w:rPr>
-        <w:rFonts w:ascii="Courier New" w:hAnsi="Courier New" w:cs="Courier New" w:hint="default"/>
+        <w:rFonts w:hint="default" w:ascii="Courier New" w:hAnsi="Courier New" w:cs="Courier New"/>
       </w:rPr>
     </w:lvl>
     <w:lvl w:ilvl="8" w:tplc="04090005" w:tentative="1">
@@ -10561,7 +10611,7 @@
         <w:ind w:left="6480" w:hanging="360"/>
       </w:pPr>
       <w:rPr>
-        <w:rFonts w:ascii="Wingdings" w:hAnsi="Wingdings" w:hint="default"/>
+        <w:rFonts w:hint="default" w:ascii="Wingdings" w:hAnsi="Wingdings"/>
       </w:rPr>
     </w:lvl>
   </w:abstractNum>
@@ -10670,11 +10720,11 @@
 </file>
 
 <file path=word/styles.xml><?xml version="1.0" encoding="utf-8"?>
-<w:styles xmlns:mc="http://schemas.openxmlformats.org/markup-compatibility/2006" xmlns:r="http://schemas.openxmlformats.org/officeDocument/2006/relationships" xmlns:w="http://schemas.openxmlformats.org/wordprocessingml/2006/main" xmlns:w14="http://schemas.microsoft.com/office/word/2010/wordml" xmlns:w15="http://schemas.microsoft.com/office/word/2012/wordml" xmlns:w16cex="http://schemas.microsoft.com/office/word/2018/wordml/cex" xmlns:w16cid="http://schemas.microsoft.com/office/word/2016/wordml/cid" xmlns:w16="http://schemas.microsoft.com/office/word/2018/wordml" xmlns:w16du="http://schemas.microsoft.com/office/word/2023/wordml/word16du" xmlns:w16sdtdh="http://schemas.microsoft.com/office/word/2020/wordml/sdtdatahash" xmlns:w16sdtfl="http://schemas.microsoft.com/office/word/2024/wordml/sdtformatlock" xmlns:w16se="http://schemas.microsoft.com/office/word/2015/wordml/symex" mc:Ignorable="w14 w15 w16se w16cid w16 w16cex w16sdtdh w16sdtfl w16du">
+<w:styles xmlns:wp14="http://schemas.microsoft.com/office/word/2010/wordprocessingDrawing" xmlns:mc="http://schemas.openxmlformats.org/markup-compatibility/2006" xmlns:r="http://schemas.openxmlformats.org/officeDocument/2006/relationships" xmlns:w="http://schemas.openxmlformats.org/wordprocessingml/2006/main" xmlns:w14="http://schemas.microsoft.com/office/word/2010/wordml" xmlns:w15="http://schemas.microsoft.com/office/word/2012/wordml" xmlns:w16cex="http://schemas.microsoft.com/office/word/2018/wordml/cex" xmlns:w16cid="http://schemas.microsoft.com/office/word/2016/wordml/cid" xmlns:w16="http://schemas.microsoft.com/office/word/2018/wordml" xmlns:w16du="http://schemas.microsoft.com/office/word/2023/wordml/word16du" xmlns:w16sdtdh="http://schemas.microsoft.com/office/word/2020/wordml/sdtdatahash" xmlns:w16sdtfl="http://schemas.microsoft.com/office/word/2024/wordml/sdtformatlock" xmlns:w16se="http://schemas.microsoft.com/office/word/2015/wordml/symex" mc:Ignorable="w14 w15 w16se w16cid w16 w16cex w16sdtdh w16sdtfl w16du wp14">
   <w:docDefaults>
     <w:rPrDefault>
       <w:rPr>
-        <w:rFonts w:asciiTheme="minorHAnsi" w:eastAsiaTheme="minorHAnsi" w:hAnsiTheme="minorHAnsi" w:cstheme="minorBidi"/>
+        <w:rFonts w:asciiTheme="minorHAnsi" w:hAnsiTheme="minorHAnsi" w:eastAsiaTheme="minorHAnsi" w:cstheme="minorBidi"/>
         <w:kern w:val="2"/>
         <w:sz w:val="24"/>
         <w:szCs w:val="24"/>
@@ -10691,14 +10741,14 @@
   <w:latentStyles w:defLockedState="0" w:defUIPriority="99" w:defSemiHidden="0" w:defUnhideWhenUsed="0" w:defQFormat="0" w:count="376">
     <w:lsdException w:name="Normal" w:uiPriority="0" w:qFormat="1"/>
     <w:lsdException w:name="heading 1" w:uiPriority="9" w:qFormat="1"/>
-    <w:lsdException w:name="heading 2" w:semiHidden="1" w:uiPriority="9" w:unhideWhenUsed="1" w:qFormat="1"/>
-    <w:lsdException w:name="heading 3" w:semiHidden="1" w:uiPriority="9" w:unhideWhenUsed="1" w:qFormat="1"/>
-    <w:lsdException w:name="heading 4" w:semiHidden="1" w:uiPriority="9" w:unhideWhenUsed="1" w:qFormat="1"/>
-    <w:lsdException w:name="heading 5" w:semiHidden="1" w:uiPriority="9" w:unhideWhenUsed="1" w:qFormat="1"/>
-    <w:lsdException w:name="heading 6" w:semiHidden="1" w:uiPriority="9" w:unhideWhenUsed="1" w:qFormat="1"/>
-    <w:lsdException w:name="heading 7" w:semiHidden="1" w:uiPriority="9" w:unhideWhenUsed="1" w:qFormat="1"/>
-    <w:lsdException w:name="heading 8" w:semiHidden="1" w:uiPriority="9" w:unhideWhenUsed="1" w:qFormat="1"/>
-    <w:lsdException w:name="heading 9" w:semiHidden="1" w:uiPriority="9" w:unhideWhenUsed="1" w:qFormat="1"/>
+    <w:lsdException w:name="heading 2" w:uiPriority="9" w:semiHidden="1" w:unhideWhenUsed="1" w:qFormat="1"/>
+    <w:lsdException w:name="heading 3" w:uiPriority="9" w:semiHidden="1" w:unhideWhenUsed="1" w:qFormat="1"/>
+    <w:lsdException w:name="heading 4" w:uiPriority="9" w:semiHidden="1" w:unhideWhenUsed="1" w:qFormat="1"/>
+    <w:lsdException w:name="heading 5" w:uiPriority="9" w:semiHidden="1" w:unhideWhenUsed="1" w:qFormat="1"/>
+    <w:lsdException w:name="heading 6" w:uiPriority="9" w:semiHidden="1" w:unhideWhenUsed="1" w:qFormat="1"/>
+    <w:lsdException w:name="heading 7" w:uiPriority="9" w:semiHidden="1" w:unhideWhenUsed="1" w:qFormat="1"/>
+    <w:lsdException w:name="heading 8" w:uiPriority="9" w:semiHidden="1" w:unhideWhenUsed="1" w:qFormat="1"/>
+    <w:lsdException w:name="heading 9" w:uiPriority="9" w:semiHidden="1" w:unhideWhenUsed="1" w:qFormat="1"/>
     <w:lsdException w:name="index 1" w:semiHidden="1" w:unhideWhenUsed="1"/>
     <w:lsdException w:name="index 2" w:semiHidden="1" w:unhideWhenUsed="1"/>
     <w:lsdException w:name="index 3" w:semiHidden="1" w:unhideWhenUsed="1"/>
@@ -10708,22 +10758,22 @@
     <w:lsdException w:name="index 7" w:semiHidden="1" w:unhideWhenUsed="1"/>
     <w:lsdException w:name="index 8" w:semiHidden="1" w:unhideWhenUsed="1"/>
     <w:lsdException w:name="index 9" w:semiHidden="1" w:unhideWhenUsed="1"/>
-    <w:lsdException w:name="toc 1" w:semiHidden="1" w:uiPriority="39" w:unhideWhenUsed="1"/>
-    <w:lsdException w:name="toc 2" w:semiHidden="1" w:uiPriority="39" w:unhideWhenUsed="1"/>
-    <w:lsdException w:name="toc 3" w:semiHidden="1" w:uiPriority="39" w:unhideWhenUsed="1"/>
-    <w:lsdException w:name="toc 4" w:semiHidden="1" w:uiPriority="39" w:unhideWhenUsed="1"/>
-    <w:lsdException w:name="toc 5" w:semiHidden="1" w:uiPriority="39" w:unhideWhenUsed="1"/>
-    <w:lsdException w:name="toc 6" w:semiHidden="1" w:uiPriority="39" w:unhideWhenUsed="1"/>
-    <w:lsdException w:name="toc 7" w:semiHidden="1" w:uiPriority="39" w:unhideWhenUsed="1"/>
-    <w:lsdException w:name="toc 8" w:semiHidden="1" w:uiPriority="39" w:unhideWhenUsed="1"/>
-    <w:lsdException w:name="toc 9" w:semiHidden="1" w:uiPriority="39" w:unhideWhenUsed="1"/>
+    <w:lsdException w:name="toc 1" w:uiPriority="39" w:semiHidden="1" w:unhideWhenUsed="1"/>
+    <w:lsdException w:name="toc 2" w:uiPriority="39" w:semiHidden="1" w:unhideWhenUsed="1"/>
+    <w:lsdException w:name="toc 3" w:uiPriority="39" w:semiHidden="1" w:unhideWhenUsed="1"/>
+    <w:lsdException w:name="toc 4" w:uiPriority="39" w:semiHidden="1" w:unhideWhenUsed="1"/>
+    <w:lsdException w:name="toc 5" w:uiPriority="39" w:semiHidden="1" w:unhideWhenUsed="1"/>
+    <w:lsdException w:name="toc 6" w:uiPriority="39" w:semiHidden="1" w:unhideWhenUsed="1"/>
+    <w:lsdException w:name="toc 7" w:uiPriority="39" w:semiHidden="1" w:unhideWhenUsed="1"/>
+    <w:lsdException w:name="toc 8" w:uiPriority="39" w:semiHidden="1" w:unhideWhenUsed="1"/>
+    <w:lsdException w:name="toc 9" w:uiPriority="39" w:semiHidden="1" w:unhideWhenUsed="1"/>
     <w:lsdException w:name="Normal Indent" w:semiHidden="1" w:unhideWhenUsed="1"/>
     <w:lsdException w:name="footnote text" w:semiHidden="1" w:unhideWhenUsed="1"/>
     <w:lsdException w:name="annotation text" w:semiHidden="1" w:unhideWhenUsed="1"/>
     <w:lsdException w:name="header" w:semiHidden="1" w:unhideWhenUsed="1"/>
     <w:lsdException w:name="footer" w:semiHidden="1" w:unhideWhenUsed="1"/>
     <w:lsdException w:name="index heading" w:semiHidden="1" w:unhideWhenUsed="1"/>
-    <w:lsdException w:name="caption" w:semiHidden="1" w:uiPriority="35" w:unhideWhenUsed="1" w:qFormat="1"/>
+    <w:lsdException w:name="caption" w:uiPriority="35" w:semiHidden="1" w:unhideWhenUsed="1" w:qFormat="1"/>
     <w:lsdException w:name="table of figures" w:semiHidden="1" w:unhideWhenUsed="1"/>
     <w:lsdException w:name="envelope address" w:semiHidden="1" w:unhideWhenUsed="1"/>
     <w:lsdException w:name="envelope return" w:semiHidden="1" w:unhideWhenUsed="1"/>
@@ -10754,7 +10804,7 @@
     <w:lsdException w:name="Title" w:uiPriority="10" w:qFormat="1"/>
     <w:lsdException w:name="Closing" w:semiHidden="1" w:unhideWhenUsed="1"/>
     <w:lsdException w:name="Signature" w:semiHidden="1" w:unhideWhenUsed="1"/>
-    <w:lsdException w:name="Default Paragraph Font" w:semiHidden="1" w:uiPriority="1" w:unhideWhenUsed="1"/>
+    <w:lsdException w:name="Default Paragraph Font" w:uiPriority="1" w:semiHidden="1" w:unhideWhenUsed="1"/>
     <w:lsdException w:name="Body Text" w:semiHidden="1" w:unhideWhenUsed="1"/>
     <w:lsdException w:name="Body Text Indent" w:semiHidden="1" w:unhideWhenUsed="1"/>
     <w:lsdException w:name="List Continue" w:semiHidden="1" w:unhideWhenUsed="1"/>
@@ -10954,8 +11004,8 @@
     <w:lsdException w:name="Subtle Reference" w:uiPriority="31" w:qFormat="1"/>
     <w:lsdException w:name="Intense Reference" w:uiPriority="32" w:qFormat="1"/>
     <w:lsdException w:name="Book Title" w:uiPriority="33" w:qFormat="1"/>
-    <w:lsdException w:name="Bibliography" w:semiHidden="1" w:uiPriority="37" w:unhideWhenUsed="1"/>
-    <w:lsdException w:name="TOC Heading" w:semiHidden="1" w:uiPriority="39" w:unhideWhenUsed="1" w:qFormat="1"/>
+    <w:lsdException w:name="Bibliography" w:uiPriority="37" w:semiHidden="1" w:unhideWhenUsed="1"/>
+    <w:lsdException w:name="TOC Heading" w:uiPriority="39" w:semiHidden="1" w:unhideWhenUsed="1" w:qFormat="1"/>
     <w:lsdException w:name="Plain Table 1" w:uiPriority="41"/>
     <w:lsdException w:name="Plain Table 2" w:uiPriority="42"/>
     <w:lsdException w:name="Plain Table 3" w:uiPriority="43"/>
@@ -11066,7 +11116,7 @@
     <w:lsdException w:name="Unresolved Mention" w:semiHidden="1" w:unhideWhenUsed="1"/>
     <w:lsdException w:name="Smart Link" w:semiHidden="1" w:unhideWhenUsed="1"/>
   </w:latentStyles>
-  <w:style w:type="paragraph" w:default="1" w:styleId="Normal">
+  <w:style w:type="paragraph" w:styleId="Normal" w:default="1">
     <w:name w:val="Normal"/>
     <w:qFormat/>
   </w:style>
@@ -11085,7 +11135,7 @@
       <w:outlineLvl w:val="0"/>
     </w:pPr>
     <w:rPr>
-      <w:rFonts w:asciiTheme="majorHAnsi" w:eastAsiaTheme="majorEastAsia" w:hAnsiTheme="majorHAnsi" w:cstheme="majorBidi"/>
+      <w:rFonts w:asciiTheme="majorHAnsi" w:hAnsiTheme="majorHAnsi" w:eastAsiaTheme="majorEastAsia" w:cstheme="majorBidi"/>
       <w:color w:val="2F5496" w:themeColor="accent1" w:themeShade="BF"/>
       <w:sz w:val="40"/>
       <w:szCs w:val="40"/>
@@ -11107,7 +11157,7 @@
       <w:outlineLvl w:val="1"/>
     </w:pPr>
     <w:rPr>
-      <w:rFonts w:asciiTheme="majorHAnsi" w:eastAsiaTheme="majorEastAsia" w:hAnsiTheme="majorHAnsi" w:cstheme="majorBidi"/>
+      <w:rFonts w:asciiTheme="majorHAnsi" w:hAnsiTheme="majorHAnsi" w:eastAsiaTheme="majorEastAsia" w:cstheme="majorBidi"/>
       <w:color w:val="2F5496" w:themeColor="accent1" w:themeShade="BF"/>
       <w:sz w:val="32"/>
       <w:szCs w:val="32"/>
@@ -11267,13 +11317,13 @@
       <w:color w:val="272727" w:themeColor="text1" w:themeTint="D8"/>
     </w:rPr>
   </w:style>
-  <w:style w:type="character" w:default="1" w:styleId="DefaultParagraphFont">
+  <w:style w:type="character" w:styleId="DefaultParagraphFont" w:default="1">
     <w:name w:val="Default Paragraph Font"/>
     <w:uiPriority w:val="1"/>
     <w:semiHidden/>
     <w:unhideWhenUsed/>
   </w:style>
-  <w:style w:type="table" w:default="1" w:styleId="TableNormal">
+  <w:style w:type="table" w:styleId="TableNormal" w:default="1">
     <w:name w:val="Normal Table"/>
     <w:uiPriority w:val="99"/>
     <w:semiHidden/>
@@ -11288,39 +11338,39 @@
       </w:tblCellMar>
     </w:tblPr>
   </w:style>
-  <w:style w:type="numbering" w:default="1" w:styleId="NoList">
+  <w:style w:type="numbering" w:styleId="NoList" w:default="1">
     <w:name w:val="No List"/>
     <w:uiPriority w:val="99"/>
     <w:semiHidden/>
     <w:unhideWhenUsed/>
   </w:style>
-  <w:style w:type="character" w:customStyle="1" w:styleId="Heading1Char">
+  <w:style w:type="character" w:styleId="Heading1Char" w:customStyle="1">
     <w:name w:val="Heading 1 Char"/>
     <w:basedOn w:val="DefaultParagraphFont"/>
     <w:link w:val="Heading1"/>
     <w:uiPriority w:val="9"/>
     <w:rsid w:val="00FF395F"/>
     <w:rPr>
-      <w:rFonts w:asciiTheme="majorHAnsi" w:eastAsiaTheme="majorEastAsia" w:hAnsiTheme="majorHAnsi" w:cstheme="majorBidi"/>
+      <w:rFonts w:asciiTheme="majorHAnsi" w:hAnsiTheme="majorHAnsi" w:eastAsiaTheme="majorEastAsia" w:cstheme="majorBidi"/>
       <w:color w:val="2F5496" w:themeColor="accent1" w:themeShade="BF"/>
       <w:sz w:val="40"/>
       <w:szCs w:val="40"/>
     </w:rPr>
   </w:style>
-  <w:style w:type="character" w:customStyle="1" w:styleId="Heading2Char">
+  <w:style w:type="character" w:styleId="Heading2Char" w:customStyle="1">
     <w:name w:val="Heading 2 Char"/>
     <w:basedOn w:val="DefaultParagraphFont"/>
     <w:link w:val="Heading2"/>
     <w:uiPriority w:val="9"/>
     <w:rsid w:val="00FF395F"/>
     <w:rPr>
-      <w:rFonts w:asciiTheme="majorHAnsi" w:eastAsiaTheme="majorEastAsia" w:hAnsiTheme="majorHAnsi" w:cstheme="majorBidi"/>
+      <w:rFonts w:asciiTheme="majorHAnsi" w:hAnsiTheme="majorHAnsi" w:eastAsiaTheme="majorEastAsia" w:cstheme="majorBidi"/>
       <w:color w:val="2F5496" w:themeColor="accent1" w:themeShade="BF"/>
       <w:sz w:val="32"/>
       <w:szCs w:val="32"/>
     </w:rPr>
   </w:style>
-  <w:style w:type="character" w:customStyle="1" w:styleId="Heading3Char">
+  <w:style w:type="character" w:styleId="Heading3Char" w:customStyle="1">
     <w:name w:val="Heading 3 Char"/>
     <w:basedOn w:val="DefaultParagraphFont"/>
     <w:link w:val="Heading3"/>
@@ -11333,7 +11383,7 @@
       <w:szCs w:val="28"/>
     </w:rPr>
   </w:style>
-  <w:style w:type="character" w:customStyle="1" w:styleId="Heading4Char">
+  <w:style w:type="character" w:styleId="Heading4Char" w:customStyle="1">
     <w:name w:val="Heading 4 Char"/>
     <w:basedOn w:val="DefaultParagraphFont"/>
     <w:link w:val="Heading4"/>
@@ -11347,7 +11397,7 @@
       <w:color w:val="2F5496" w:themeColor="accent1" w:themeShade="BF"/>
     </w:rPr>
   </w:style>
-  <w:style w:type="character" w:customStyle="1" w:styleId="Heading5Char">
+  <w:style w:type="character" w:styleId="Heading5Char" w:customStyle="1">
     <w:name w:val="Heading 5 Char"/>
     <w:basedOn w:val="DefaultParagraphFont"/>
     <w:link w:val="Heading5"/>
@@ -11359,7 +11409,7 @@
       <w:color w:val="2F5496" w:themeColor="accent1" w:themeShade="BF"/>
     </w:rPr>
   </w:style>
-  <w:style w:type="character" w:customStyle="1" w:styleId="Heading6Char">
+  <w:style w:type="character" w:styleId="Heading6Char" w:customStyle="1">
     <w:name w:val="Heading 6 Char"/>
     <w:basedOn w:val="DefaultParagraphFont"/>
     <w:link w:val="Heading6"/>
@@ -11373,7 +11423,7 @@
       <w:color w:val="595959" w:themeColor="text1" w:themeTint="A6"/>
     </w:rPr>
   </w:style>
-  <w:style w:type="character" w:customStyle="1" w:styleId="Heading7Char">
+  <w:style w:type="character" w:styleId="Heading7Char" w:customStyle="1">
     <w:name w:val="Heading 7 Char"/>
     <w:basedOn w:val="DefaultParagraphFont"/>
     <w:link w:val="Heading7"/>
@@ -11385,7 +11435,7 @@
       <w:color w:val="595959" w:themeColor="text1" w:themeTint="A6"/>
     </w:rPr>
   </w:style>
-  <w:style w:type="character" w:customStyle="1" w:styleId="Heading8Char">
+  <w:style w:type="character" w:styleId="Heading8Char" w:customStyle="1">
     <w:name w:val="Heading 8 Char"/>
     <w:basedOn w:val="DefaultParagraphFont"/>
     <w:link w:val="Heading8"/>
@@ -11399,7 +11449,7 @@
       <w:color w:val="272727" w:themeColor="text1" w:themeTint="D8"/>
     </w:rPr>
   </w:style>
-  <w:style w:type="character" w:customStyle="1" w:styleId="Heading9Char">
+  <w:style w:type="character" w:styleId="Heading9Char" w:customStyle="1">
     <w:name w:val="Heading 9 Char"/>
     <w:basedOn w:val="DefaultParagraphFont"/>
     <w:link w:val="Heading9"/>
@@ -11424,21 +11474,21 @@
       <w:contextualSpacing/>
     </w:pPr>
     <w:rPr>
-      <w:rFonts w:asciiTheme="majorHAnsi" w:eastAsiaTheme="majorEastAsia" w:hAnsiTheme="majorHAnsi" w:cstheme="majorBidi"/>
+      <w:rFonts w:asciiTheme="majorHAnsi" w:hAnsiTheme="majorHAnsi" w:eastAsiaTheme="majorEastAsia" w:cstheme="majorBidi"/>
       <w:spacing w:val="-10"/>
       <w:kern w:val="28"/>
       <w:sz w:val="56"/>
       <w:szCs w:val="56"/>
     </w:rPr>
   </w:style>
-  <w:style w:type="character" w:customStyle="1" w:styleId="TitleChar">
+  <w:style w:type="character" w:styleId="TitleChar" w:customStyle="1">
     <w:name w:val="Title Char"/>
     <w:basedOn w:val="DefaultParagraphFont"/>
     <w:link w:val="Title"/>
     <w:uiPriority w:val="10"/>
     <w:rsid w:val="00FF395F"/>
     <w:rPr>
-      <w:rFonts w:asciiTheme="majorHAnsi" w:eastAsiaTheme="majorEastAsia" w:hAnsiTheme="majorHAnsi" w:cstheme="majorBidi"/>
+      <w:rFonts w:asciiTheme="majorHAnsi" w:hAnsiTheme="majorHAnsi" w:eastAsiaTheme="majorEastAsia" w:cstheme="majorBidi"/>
       <w:spacing w:val="-10"/>
       <w:kern w:val="28"/>
       <w:sz w:val="56"/>
@@ -11466,7 +11516,7 @@
       <w:szCs w:val="28"/>
     </w:rPr>
   </w:style>
-  <w:style w:type="character" w:customStyle="1" w:styleId="SubtitleChar">
+  <w:style w:type="character" w:styleId="SubtitleChar" w:customStyle="1">
     <w:name w:val="Subtitle Char"/>
     <w:basedOn w:val="DefaultParagraphFont"/>
     <w:link w:val="Subtitle"/>
@@ -11498,7 +11548,7 @@
       <w:color w:val="404040" w:themeColor="text1" w:themeTint="BF"/>
     </w:rPr>
   </w:style>
-  <w:style w:type="character" w:customStyle="1" w:styleId="QuoteChar">
+  <w:style w:type="character" w:styleId="QuoteChar" w:customStyle="1">
     <w:name w:val="Quote Char"/>
     <w:basedOn w:val="DefaultParagraphFont"/>
     <w:link w:val="Quote"/>
@@ -11543,8 +11593,8 @@
     <w:rsid w:val="00FF395F"/>
     <w:pPr>
       <w:pBdr>
-        <w:top w:val="single" w:sz="4" w:space="10" w:color="2F5496" w:themeColor="accent1" w:themeShade="BF"/>
-        <w:bottom w:val="single" w:sz="4" w:space="10" w:color="2F5496" w:themeColor="accent1" w:themeShade="BF"/>
+        <w:top w:val="single" w:color="2F5496" w:themeColor="accent1" w:themeShade="BF" w:sz="4" w:space="10"/>
+        <w:bottom w:val="single" w:color="2F5496" w:themeColor="accent1" w:themeShade="BF" w:sz="4" w:space="10"/>
       </w:pBdr>
       <w:spacing w:before="360" w:after="360"/>
       <w:ind w:left="864" w:right="864"/>
@@ -11556,7 +11606,7 @@
       <w:color w:val="2F5496" w:themeColor="accent1" w:themeShade="BF"/>
     </w:rPr>
   </w:style>
-  <w:style w:type="character" w:customStyle="1" w:styleId="IntenseQuoteChar">
+  <w:style w:type="character" w:styleId="IntenseQuoteChar" w:customStyle="1">
     <w:name w:val="Intense Quote Char"/>
     <w:basedOn w:val="DefaultParagraphFont"/>
     <w:link w:val="IntenseQuote"/>
@@ -11665,7 +11715,7 @@
       <w:szCs w:val="20"/>
     </w:rPr>
   </w:style>
-  <w:style w:type="character" w:customStyle="1" w:styleId="FootnoteTextChar">
+  <w:style w:type="character" w:styleId="FootnoteTextChar" w:customStyle="1">
     <w:name w:val="Footnote Text Char"/>
     <w:basedOn w:val="DefaultParagraphFont"/>
     <w:link w:val="FootnoteText"/>
@@ -11735,7 +11785,7 @@
       <w:szCs w:val="20"/>
     </w:rPr>
   </w:style>
-  <w:style w:type="character" w:customStyle="1" w:styleId="EndnoteTextChar">
+  <w:style w:type="character" w:styleId="EndnoteTextChar" w:customStyle="1">
     <w:name w:val="Endnote Text Char"/>
     <w:basedOn w:val="DefaultParagraphFont"/>
     <w:link w:val="EndnoteText"/>
@@ -11781,12 +11831,12 @@
     </w:pPr>
     <w:tblPr>
       <w:tblBorders>
-        <w:top w:val="single" w:sz="4" w:space="0" w:color="auto"/>
-        <w:left w:val="single" w:sz="4" w:space="0" w:color="auto"/>
-        <w:bottom w:val="single" w:sz="4" w:space="0" w:color="auto"/>
-        <w:right w:val="single" w:sz="4" w:space="0" w:color="auto"/>
-        <w:insideH w:val="single" w:sz="4" w:space="0" w:color="auto"/>
-        <w:insideV w:val="single" w:sz="4" w:space="0" w:color="auto"/>
+        <w:top w:val="single" w:color="auto" w:sz="4" w:space="0"/>
+        <w:left w:val="single" w:color="auto" w:sz="4" w:space="0"/>
+        <w:bottom w:val="single" w:color="auto" w:sz="4" w:space="0"/>
+        <w:right w:val="single" w:color="auto" w:sz="4" w:space="0"/>
+        <w:insideH w:val="single" w:color="auto" w:sz="4" w:space="0"/>
+        <w:insideV w:val="single" w:color="auto" w:sz="4" w:space="0"/>
       </w:tblBorders>
     </w:tblPr>
   </w:style>
@@ -11854,7 +11904,7 @@
       <w:spacing w:after="0" w:line="240" w:lineRule="auto"/>
     </w:pPr>
   </w:style>
-  <w:style w:type="character" w:customStyle="1" w:styleId="HeaderChar">
+  <w:style w:type="character" w:styleId="HeaderChar" w:customStyle="1">
     <w:name w:val="Header Char"/>
     <w:basedOn w:val="DefaultParagraphFont"/>
     <w:link w:val="Header"/>
@@ -11876,7 +11926,7 @@
       <w:spacing w:after="0" w:line="240" w:lineRule="auto"/>
     </w:pPr>
   </w:style>
-  <w:style w:type="character" w:customStyle="1" w:styleId="FooterChar">
+  <w:style w:type="character" w:styleId="FooterChar" w:customStyle="1">
     <w:name w:val="Footer Char"/>
     <w:basedOn w:val="DefaultParagraphFont"/>
     <w:link w:val="Footer"/>
@@ -11900,7 +11950,7 @@
     </w:tblPr>
     <w:tblStylePr w:type="firstRow">
       <w:rPr>
-        <w:rFonts w:asciiTheme="majorHAnsi" w:eastAsiaTheme="majorEastAsia" w:hAnsiTheme="majorHAnsi" w:cstheme="majorBidi"/>
+        <w:rFonts w:asciiTheme="majorHAnsi" w:hAnsiTheme="majorHAnsi" w:eastAsiaTheme="majorEastAsia" w:cstheme="majorBidi"/>
         <w:i/>
         <w:iCs/>
         <w:sz w:val="26"/>
@@ -11908,14 +11958,14 @@
       <w:tblPr/>
       <w:tcPr>
         <w:tcBorders>
-          <w:bottom w:val="single" w:sz="4" w:space="0" w:color="A5A5A5" w:themeColor="accent3"/>
+          <w:bottom w:val="single" w:color="A5A5A5" w:themeColor="accent3" w:sz="4" w:space="0"/>
         </w:tcBorders>
         <w:shd w:val="clear" w:color="auto" w:fill="FFFFFF" w:themeFill="background1"/>
       </w:tcPr>
     </w:tblStylePr>
     <w:tblStylePr w:type="lastRow">
       <w:rPr>
-        <w:rFonts w:asciiTheme="majorHAnsi" w:eastAsiaTheme="majorEastAsia" w:hAnsiTheme="majorHAnsi" w:cstheme="majorBidi"/>
+        <w:rFonts w:asciiTheme="majorHAnsi" w:hAnsiTheme="majorHAnsi" w:eastAsiaTheme="majorEastAsia" w:cstheme="majorBidi"/>
         <w:i/>
         <w:iCs/>
         <w:sz w:val="26"/>
@@ -11923,7 +11973,7 @@
       <w:tblPr/>
       <w:tcPr>
         <w:tcBorders>
-          <w:top w:val="single" w:sz="4" w:space="0" w:color="A5A5A5" w:themeColor="accent3"/>
+          <w:top w:val="single" w:color="A5A5A5" w:themeColor="accent3" w:sz="4" w:space="0"/>
         </w:tcBorders>
         <w:shd w:val="clear" w:color="auto" w:fill="FFFFFF" w:themeFill="background1"/>
       </w:tcPr>
@@ -11933,7 +11983,7 @@
         <w:jc w:val="right"/>
       </w:pPr>
       <w:rPr>
-        <w:rFonts w:asciiTheme="majorHAnsi" w:eastAsiaTheme="majorEastAsia" w:hAnsiTheme="majorHAnsi" w:cstheme="majorBidi"/>
+        <w:rFonts w:asciiTheme="majorHAnsi" w:hAnsiTheme="majorHAnsi" w:eastAsiaTheme="majorEastAsia" w:cstheme="majorBidi"/>
         <w:i/>
         <w:iCs/>
         <w:sz w:val="26"/>
@@ -11941,14 +11991,14 @@
       <w:tblPr/>
       <w:tcPr>
         <w:tcBorders>
-          <w:right w:val="single" w:sz="4" w:space="0" w:color="A5A5A5" w:themeColor="accent3"/>
+          <w:right w:val="single" w:color="A5A5A5" w:themeColor="accent3" w:sz="4" w:space="0"/>
         </w:tcBorders>
         <w:shd w:val="clear" w:color="auto" w:fill="FFFFFF" w:themeFill="background1"/>
       </w:tcPr>
     </w:tblStylePr>
     <w:tblStylePr w:type="lastCol">
       <w:rPr>
-        <w:rFonts w:asciiTheme="majorHAnsi" w:eastAsiaTheme="majorEastAsia" w:hAnsiTheme="majorHAnsi" w:cstheme="majorBidi"/>
+        <w:rFonts w:asciiTheme="majorHAnsi" w:hAnsiTheme="majorHAnsi" w:eastAsiaTheme="majorEastAsia" w:cstheme="majorBidi"/>
         <w:i/>
         <w:iCs/>
         <w:sz w:val="26"/>
@@ -11956,7 +12006,7 @@
       <w:tblPr/>
       <w:tcPr>
         <w:tcBorders>
-          <w:left w:val="single" w:sz="4" w:space="0" w:color="A5A5A5" w:themeColor="accent3"/>
+          <w:left w:val="single" w:color="A5A5A5" w:themeColor="accent3" w:sz="4" w:space="0"/>
         </w:tcBorders>
         <w:shd w:val="clear" w:color="auto" w:fill="FFFFFF" w:themeFill="background1"/>
       </w:tcPr>
@@ -12026,7 +12076,7 @@
       <w:tblPr/>
       <w:tcPr>
         <w:tcBorders>
-          <w:bottom w:val="single" w:sz="4" w:space="0" w:color="666666" w:themeColor="text1" w:themeTint="99"/>
+          <w:bottom w:val="single" w:color="666666" w:themeColor="text1" w:themeTint="99" w:sz="4" w:space="0"/>
         </w:tcBorders>
       </w:tcPr>
     </w:tblStylePr>
@@ -12038,7 +12088,7 @@
       <w:tblPr/>
       <w:tcPr>
         <w:tcBorders>
-          <w:top w:val="single" w:sz="4" w:space="0" w:color="666666" w:themeColor="text1" w:themeTint="99"/>
+          <w:top w:val="single" w:color="666666" w:themeColor="text1" w:themeTint="99" w:sz="4" w:space="0"/>
         </w:tcBorders>
       </w:tcPr>
     </w:tblStylePr>
@@ -12079,8 +12129,8 @@
       <w:tblStyleRowBandSize w:val="1"/>
       <w:tblStyleColBandSize w:val="1"/>
       <w:tblBorders>
-        <w:top w:val="single" w:sz="4" w:space="0" w:color="7F7F7F" w:themeColor="text1" w:themeTint="80"/>
-        <w:bottom w:val="single" w:sz="4" w:space="0" w:color="7F7F7F" w:themeColor="text1" w:themeTint="80"/>
+        <w:top w:val="single" w:color="7F7F7F" w:themeColor="text1" w:themeTint="80" w:sz="4" w:space="0"/>
+        <w:bottom w:val="single" w:color="7F7F7F" w:themeColor="text1" w:themeTint="80" w:sz="4" w:space="0"/>
       </w:tblBorders>
     </w:tblPr>
     <w:tblStylePr w:type="firstRow">
@@ -12091,7 +12141,7 @@
       <w:tblPr/>
       <w:tcPr>
         <w:tcBorders>
-          <w:bottom w:val="single" w:sz="4" w:space="0" w:color="7F7F7F" w:themeColor="text1" w:themeTint="80"/>
+          <w:bottom w:val="single" w:color="7F7F7F" w:themeColor="text1" w:themeTint="80" w:sz="4" w:space="0"/>
         </w:tcBorders>
       </w:tcPr>
     </w:tblStylePr>
@@ -12103,7 +12153,7 @@
       <w:tblPr/>
       <w:tcPr>
         <w:tcBorders>
-          <w:top w:val="single" w:sz="4" w:space="0" w:color="7F7F7F" w:themeColor="text1" w:themeTint="80"/>
+          <w:top w:val="single" w:color="7F7F7F" w:themeColor="text1" w:themeTint="80" w:sz="4" w:space="0"/>
         </w:tcBorders>
       </w:tcPr>
     </w:tblStylePr>
@@ -12123,8 +12173,8 @@
       <w:tblPr/>
       <w:tcPr>
         <w:tcBorders>
-          <w:left w:val="single" w:sz="4" w:space="0" w:color="7F7F7F" w:themeColor="text1" w:themeTint="80"/>
-          <w:right w:val="single" w:sz="4" w:space="0" w:color="7F7F7F" w:themeColor="text1" w:themeTint="80"/>
+          <w:left w:val="single" w:color="7F7F7F" w:themeColor="text1" w:themeTint="80" w:sz="4" w:space="0"/>
+          <w:right w:val="single" w:color="7F7F7F" w:themeColor="text1" w:themeTint="80" w:sz="4" w:space="0"/>
         </w:tcBorders>
       </w:tcPr>
     </w:tblStylePr>
@@ -12132,8 +12182,8 @@
       <w:tblPr/>
       <w:tcPr>
         <w:tcBorders>
-          <w:left w:val="single" w:sz="4" w:space="0" w:color="7F7F7F" w:themeColor="text1" w:themeTint="80"/>
-          <w:right w:val="single" w:sz="4" w:space="0" w:color="7F7F7F" w:themeColor="text1" w:themeTint="80"/>
+          <w:left w:val="single" w:color="7F7F7F" w:themeColor="text1" w:themeTint="80" w:sz="4" w:space="0"/>
+          <w:right w:val="single" w:color="7F7F7F" w:themeColor="text1" w:themeTint="80" w:sz="4" w:space="0"/>
         </w:tcBorders>
       </w:tcPr>
     </w:tblStylePr>
@@ -12141,8 +12191,8 @@
       <w:tblPr/>
       <w:tcPr>
         <w:tcBorders>
-          <w:top w:val="single" w:sz="4" w:space="0" w:color="7F7F7F" w:themeColor="text1" w:themeTint="80"/>
-          <w:bottom w:val="single" w:sz="4" w:space="0" w:color="7F7F7F" w:themeColor="text1" w:themeTint="80"/>
+          <w:top w:val="single" w:color="7F7F7F" w:themeColor="text1" w:themeTint="80" w:sz="4" w:space="0"/>
+          <w:bottom w:val="single" w:color="7F7F7F" w:themeColor="text1" w:themeTint="80" w:sz="4" w:space="0"/>
         </w:tcBorders>
       </w:tcPr>
     </w:tblStylePr>
@@ -12161,7 +12211,7 @@
 </file>
 
 <file path=word/theme/theme1.xml><?xml version="1.0" encoding="utf-8"?>
-<a:theme xmlns:a="http://schemas.openxmlformats.org/drawingml/2006/main" name="Office Theme">
+<a:theme xmlns:a="http://schemas.openxmlformats.org/drawingml/2006/main" xmlns:thm15="http://schemas.microsoft.com/office/thememl/2012/main" name="Office Theme">
   <a:themeElements>
     <a:clrScheme name="Office">
       <a:dk1>

</xml_diff>